<commit_message>
Update governance roles: define Data Manager as Data Specialist and Data Custodian as technical support under DSI
</commit_message>
<xml_diff>
--- a/001Dc_Po_SI_18_Charte_Gouvernance.docx
+++ b/001Dc_Po_SI_18_Charte_Gouvernance.docx
@@ -1433,12 +1433,7 @@
               </w:rPr>
             </w:pPr>
             <w:r>
-              <w:rPr>
-                <w:rFonts w:ascii="Arial" w:hAnsi="Arial" w:cs="Arial"/>
-                <w:sz w:val="18"/>
-                <w:szCs w:val="18"/>
-              </w:rPr>
-              <w:t>Profil en Gouvernance des Données, maîtrise des concepts de qualité, de conformité et de cycles de vie des données.</w:t>
+              <w:t>Spécialiste de la donnée (Data Specialist), maîtrise des concepts de qualité, de conformité et de cycles de vie des données.</w:t>
             </w:r>
           </w:p>
         </w:tc>
@@ -1533,12 +1528,7 @@
               </w:rPr>
             </w:pPr>
             <w:r>
-              <w:rPr>
-                <w:rFonts w:ascii="Arial" w:eastAsia="Arial" w:hAnsi="Arial" w:cs="Arial"/>
-                <w:sz w:val="18"/>
-                <w:szCs w:val="18"/>
-              </w:rPr>
-              <w:t>Responsabilité technique de la sécurité, du stockage, de la disponibilité et de l'intégrité physique des données.</w:t>
+              <w:t>Aide technique pour la mise en œuvre : gestion des interfaces d'intégration, support technique des flux, stockage et intégrité physique des données.</w:t>
             </w:r>
           </w:p>
         </w:tc>
@@ -1569,12 +1559,7 @@
               </w:rPr>
             </w:pPr>
             <w:r>
-              <w:rPr>
-                <w:rFonts w:ascii="Arial" w:eastAsia="Arial" w:hAnsi="Arial" w:cs="Arial"/>
-                <w:sz w:val="18"/>
-                <w:szCs w:val="18"/>
-              </w:rPr>
-              <w:t>Administrateur de bases de données ou responsable infrastructure SI.</w:t>
+              <w:t>Profil d'aide/support technique (gestionnaire d'interfaces, administrateur système ou bases de données).</w:t>
             </w:r>
           </w:p>
         </w:tc>

</xml_diff>

<commit_message>
Update data governance and management documentation
</commit_message>
<xml_diff>
--- a/001Dc_Po_SI_18_Charte_Gouvernance.docx
+++ b/001Dc_Po_SI_18_Charte_Gouvernance.docx
@@ -1409,7 +1409,7 @@
                 <w:sz w:val="18"/>
                 <w:szCs w:val="18"/>
               </w:rPr>
-              <w:t>Coordination des Data Stewards. Garant du respect du processus de gouvernance. Consolidation et production des tableaux de bord d'animation et de conformité de la gouvernance.</w:t>
+              <w:t>Coordination des Data Stewards. Garant du respect des processus de gouvernance. Consolidation et production des tableaux de bord d'animation, de qualité et de conformité.</w:t>
             </w:r>
           </w:p>
         </w:tc>
@@ -1433,7 +1433,60 @@
               </w:rPr>
             </w:pPr>
             <w:r>
-              <w:t>Spécialiste de la donnée (Data Specialist), maîtrise des concepts de qualité, de conformité et de cycles de vie des données.</w:t>
+              <w:rPr>
+                <w:rFonts w:ascii="Arial" w:hAnsi="Arial" w:cs="Arial"/>
+                <w:sz w:val="18"/>
+                <w:szCs w:val="18"/>
+              </w:rPr>
+              <w:t>Spécialiste de la donnée</w:t>
+            </w:r>
+            <w:r>
+              <w:rPr>
+                <w:rFonts w:ascii="Arial" w:hAnsi="Arial" w:cs="Arial"/>
+                <w:sz w:val="18"/>
+                <w:szCs w:val="18"/>
+              </w:rPr>
+              <w:t xml:space="preserve"> </w:t>
+            </w:r>
+            <w:r>
+              <w:rPr>
+                <w:rFonts w:ascii="Arial" w:hAnsi="Arial" w:cs="Arial"/>
+                <w:sz w:val="18"/>
+                <w:szCs w:val="18"/>
+              </w:rPr>
+              <w:t xml:space="preserve">, </w:t>
+            </w:r>
+            <w:r>
+              <w:rPr>
+                <w:rFonts w:ascii="Arial" w:hAnsi="Arial" w:cs="Arial"/>
+                <w:sz w:val="18"/>
+                <w:szCs w:val="18"/>
+              </w:rPr>
+              <w:t>m</w:t>
+            </w:r>
+            <w:r>
+              <w:rPr>
+                <w:rFonts w:ascii="Arial" w:hAnsi="Arial" w:cs="Arial"/>
+                <w:sz w:val="18"/>
+                <w:szCs w:val="18"/>
+              </w:rPr>
+              <w:t>aîtrise</w:t>
+            </w:r>
+            <w:r>
+              <w:rPr>
+                <w:rFonts w:ascii="Arial" w:hAnsi="Arial" w:cs="Arial"/>
+                <w:sz w:val="18"/>
+                <w:szCs w:val="18"/>
+              </w:rPr>
+              <w:t xml:space="preserve"> </w:t>
+            </w:r>
+            <w:r>
+              <w:rPr>
+                <w:rFonts w:ascii="Arial" w:hAnsi="Arial" w:cs="Arial"/>
+                <w:sz w:val="18"/>
+                <w:szCs w:val="18"/>
+              </w:rPr>
+              <w:t>des concepts de qualité, de modélisation, de conformité et des cycles de vie des données complexes.</w:t>
             </w:r>
           </w:p>
         </w:tc>
@@ -1497,7 +1550,7 @@
                 <w:sz w:val="18"/>
                 <w:szCs w:val="18"/>
               </w:rPr>
-              <w:t xml:space="preserve"> (DSI)</w:t>
+              <w:t xml:space="preserve"> </w:t>
             </w:r>
           </w:p>
         </w:tc>
@@ -1523,12 +1576,18 @@
               </w:pBdr>
               <w:spacing w:before="150" w:after="150" w:line="275" w:lineRule="auto"/>
               <w:rPr>
+                <w:rFonts w:ascii="Arial" w:hAnsi="Arial" w:cs="Arial"/>
                 <w:sz w:val="18"/>
                 <w:szCs w:val="18"/>
               </w:rPr>
             </w:pPr>
             <w:r>
-              <w:t>Aide technique pour la mise en œuvre : gestion des interfaces d'intégration, support technique des flux, stockage et intégrité physique des données.</w:t>
+              <w:rPr>
+                <w:rFonts w:ascii="Arial" w:hAnsi="Arial" w:cs="Arial"/>
+                <w:sz w:val="18"/>
+                <w:szCs w:val="18"/>
+              </w:rPr>
+              <w:t>Aide technique pour la mise en œuvre : gestion des interfaces d'intégration, stockage et intégrité physique des données.</w:t>
             </w:r>
           </w:p>
         </w:tc>
@@ -1554,12 +1613,34 @@
               </w:pBdr>
               <w:spacing w:before="150" w:after="150" w:line="275" w:lineRule="auto"/>
               <w:rPr>
+                <w:rFonts w:ascii="Arial" w:hAnsi="Arial" w:cs="Arial"/>
                 <w:sz w:val="18"/>
                 <w:szCs w:val="18"/>
               </w:rPr>
             </w:pPr>
             <w:r>
-              <w:t>Profil d'aide/support technique (gestionnaire d'interfaces, administrateur système ou bases de données).</w:t>
+              <w:rPr>
+                <w:rFonts w:ascii="Arial" w:hAnsi="Arial" w:cs="Arial"/>
+                <w:sz w:val="18"/>
+                <w:szCs w:val="18"/>
+              </w:rPr>
+              <w:t>Profil d'aide</w:t>
+            </w:r>
+            <w:r>
+              <w:rPr>
+                <w:rFonts w:ascii="Arial" w:hAnsi="Arial" w:cs="Arial"/>
+                <w:sz w:val="18"/>
+                <w:szCs w:val="18"/>
+              </w:rPr>
+              <w:t> ,</w:t>
+            </w:r>
+            <w:r>
+              <w:rPr>
+                <w:rFonts w:ascii="Arial" w:hAnsi="Arial" w:cs="Arial"/>
+                <w:sz w:val="18"/>
+                <w:szCs w:val="18"/>
+              </w:rPr>
+              <w:t>support technique (gestionnaire d'interfaces, administrateur système ou bases de données).</w:t>
             </w:r>
           </w:p>
         </w:tc>
@@ -1759,9 +1840,9 @@
         <w:tblLook w:val="0600" w:firstRow="0" w:lastRow="0" w:firstColumn="0" w:lastColumn="0" w:noHBand="1" w:noVBand="1"/>
       </w:tblPr>
       <w:tblGrid>
-        <w:gridCol w:w="802"/>
+        <w:gridCol w:w="892"/>
         <w:gridCol w:w="1530"/>
-        <w:gridCol w:w="7396"/>
+        <w:gridCol w:w="7306"/>
       </w:tblGrid>
       <w:tr>
         <w:trPr>
@@ -1769,7 +1850,7 @@
         </w:trPr>
         <w:tc>
           <w:tcPr>
-            <w:tcW w:w="802" w:type="dxa"/>
+            <w:tcW w:w="892" w:type="dxa"/>
             <w:shd w:val="clear" w:color="auto" w:fill="DEEAF6" w:themeFill="accent1" w:themeFillTint="33"/>
           </w:tcPr>
           <w:p>
@@ -1788,16 +1869,30 @@
                 <w:szCs w:val="18"/>
               </w:rPr>
             </w:pPr>
-            <w:proofErr w:type="spellStart"/>
             <w:r>
               <w:rPr>
                 <w:rFonts w:ascii="Arial" w:eastAsia="Arial" w:hAnsi="Arial" w:cs="Arial"/>
                 <w:sz w:val="18"/>
                 <w:szCs w:val="18"/>
               </w:rPr>
-              <w:t>Numéo</w:t>
+              <w:t>Numé</w:t>
             </w:r>
-            <w:proofErr w:type="spellEnd"/>
+            <w:r>
+              <w:rPr>
+                <w:rFonts w:ascii="Arial" w:eastAsia="Arial" w:hAnsi="Arial" w:cs="Arial"/>
+                <w:sz w:val="18"/>
+                <w:szCs w:val="18"/>
+              </w:rPr>
+              <w:t>r</w:t>
+            </w:r>
+            <w:r>
+              <w:rPr>
+                <w:rFonts w:ascii="Arial" w:eastAsia="Arial" w:hAnsi="Arial" w:cs="Arial"/>
+                <w:sz w:val="18"/>
+                <w:szCs w:val="18"/>
+              </w:rPr>
+              <w:t>o</w:t>
+            </w:r>
           </w:p>
         </w:tc>
         <w:tc>
@@ -1838,7 +1933,7 @@
         </w:tc>
         <w:tc>
           <w:tcPr>
-            <w:tcW w:w="7396" w:type="dxa"/>
+            <w:tcW w:w="7306" w:type="dxa"/>
             <w:shd w:val="clear" w:color="auto" w:fill="DEEAF6" w:themeFill="accent1" w:themeFillTint="33"/>
             <w:tcMar>
               <w:top w:w="150" w:type="dxa"/>
@@ -1876,7 +1971,7 @@
       <w:tr>
         <w:tc>
           <w:tcPr>
-            <w:tcW w:w="802" w:type="dxa"/>
+            <w:tcW w:w="892" w:type="dxa"/>
           </w:tcPr>
           <w:p>
             <w:pPr>
@@ -1942,7 +2037,7 @@
         </w:tc>
         <w:tc>
           <w:tcPr>
-            <w:tcW w:w="7396" w:type="dxa"/>
+            <w:tcW w:w="7306" w:type="dxa"/>
             <w:shd w:val="clear" w:color="auto" w:fill="auto"/>
             <w:tcMar>
               <w:top w:w="150" w:type="dxa"/>
@@ -1981,7 +2076,7 @@
       <w:tr>
         <w:tc>
           <w:tcPr>
-            <w:tcW w:w="802" w:type="dxa"/>
+            <w:tcW w:w="892" w:type="dxa"/>
           </w:tcPr>
           <w:p>
             <w:pPr>
@@ -2048,7 +2143,7 @@
         </w:tc>
         <w:tc>
           <w:tcPr>
-            <w:tcW w:w="7396" w:type="dxa"/>
+            <w:tcW w:w="7306" w:type="dxa"/>
             <w:shd w:val="clear" w:color="auto" w:fill="auto"/>
             <w:tcMar>
               <w:top w:w="150" w:type="dxa"/>
@@ -2086,7 +2181,7 @@
       <w:tr>
         <w:tc>
           <w:tcPr>
-            <w:tcW w:w="802" w:type="dxa"/>
+            <w:tcW w:w="892" w:type="dxa"/>
           </w:tcPr>
           <w:p>
             <w:pPr>
@@ -2152,7 +2247,7 @@
         </w:tc>
         <w:tc>
           <w:tcPr>
-            <w:tcW w:w="7396" w:type="dxa"/>
+            <w:tcW w:w="7306" w:type="dxa"/>
             <w:shd w:val="clear" w:color="auto" w:fill="auto"/>
             <w:tcMar>
               <w:top w:w="150" w:type="dxa"/>
@@ -2191,7 +2286,7 @@
       <w:tr>
         <w:tc>
           <w:tcPr>
-            <w:tcW w:w="802" w:type="dxa"/>
+            <w:tcW w:w="892" w:type="dxa"/>
           </w:tcPr>
           <w:p>
             <w:pPr>
@@ -2259,7 +2354,7 @@
         </w:tc>
         <w:tc>
           <w:tcPr>
-            <w:tcW w:w="7396" w:type="dxa"/>
+            <w:tcW w:w="7306" w:type="dxa"/>
             <w:shd w:val="clear" w:color="auto" w:fill="auto"/>
             <w:tcMar>
               <w:top w:w="150" w:type="dxa"/>
@@ -2297,7 +2392,7 @@
       <w:tr>
         <w:tc>
           <w:tcPr>
-            <w:tcW w:w="802" w:type="dxa"/>
+            <w:tcW w:w="892" w:type="dxa"/>
           </w:tcPr>
           <w:p>
             <w:pPr>
@@ -2363,7 +2458,7 @@
         </w:tc>
         <w:tc>
           <w:tcPr>
-            <w:tcW w:w="7396" w:type="dxa"/>
+            <w:tcW w:w="7306" w:type="dxa"/>
             <w:shd w:val="clear" w:color="auto" w:fill="auto"/>
             <w:tcMar>
               <w:top w:w="150" w:type="dxa"/>
@@ -2401,7 +2496,7 @@
       <w:tr>
         <w:tc>
           <w:tcPr>
-            <w:tcW w:w="802" w:type="dxa"/>
+            <w:tcW w:w="892" w:type="dxa"/>
           </w:tcPr>
           <w:p>
             <w:pPr>
@@ -2468,7 +2563,7 @@
         </w:tc>
         <w:tc>
           <w:tcPr>
-            <w:tcW w:w="7396" w:type="dxa"/>
+            <w:tcW w:w="7306" w:type="dxa"/>
             <w:shd w:val="clear" w:color="auto" w:fill="auto"/>
             <w:tcMar>
               <w:top w:w="150" w:type="dxa"/>
@@ -3027,7 +3122,7 @@
         <w:pStyle w:val="Paragraphedeliste"/>
         <w:numPr>
           <w:ilvl w:val="0"/>
-          <w:numId w:val="46"/>
+          <w:numId w:val="48"/>
         </w:numPr>
         <w:tabs>
           <w:tab w:val="left" w:pos="939"/>
@@ -3052,7 +3147,7 @@
           <w:sz w:val="20"/>
           <w:szCs w:val="20"/>
         </w:rPr>
-        <w:t>Piloter les processus de gouvernance avec rigueur.</w:t>
+        <w:t>Piloter les processus de gouvernance avec une approche d'ingénierie des données et d'architecture MDM.</w:t>
       </w:r>
     </w:p>
     <w:p>
@@ -3060,7 +3155,7 @@
         <w:pStyle w:val="Paragraphedeliste"/>
         <w:numPr>
           <w:ilvl w:val="0"/>
-          <w:numId w:val="46"/>
+          <w:numId w:val="48"/>
         </w:numPr>
         <w:tabs>
           <w:tab w:val="left" w:pos="939"/>
@@ -3085,7 +3180,27 @@
           <w:sz w:val="20"/>
           <w:szCs w:val="20"/>
         </w:rPr>
-        <w:t>Consolider les définitions métiers des attributs de données.</w:t>
+        <w:t>Consolider et harmoniser les définitions métiers, les dict</w:t>
+      </w:r>
+      <w:r>
+        <w:rPr>
+          <w:rFonts w:ascii="Arial" w:eastAsia="Calibri" w:hAnsi="Arial" w:cs="Arial"/>
+          <w:bCs/>
+          <w:color w:val="000000"/>
+          <w:sz w:val="20"/>
+          <w:szCs w:val="20"/>
+        </w:rPr>
+        <w:t>i</w:t>
+      </w:r>
+      <w:r>
+        <w:rPr>
+          <w:rFonts w:ascii="Arial" w:eastAsia="Calibri" w:hAnsi="Arial" w:cs="Arial"/>
+          <w:bCs/>
+          <w:color w:val="000000"/>
+          <w:sz w:val="20"/>
+          <w:szCs w:val="20"/>
+        </w:rPr>
+        <w:t>onnaires et les structures de données.</w:t>
       </w:r>
     </w:p>
     <w:p>
@@ -3093,7 +3208,7 @@
         <w:pStyle w:val="Paragraphedeliste"/>
         <w:numPr>
           <w:ilvl w:val="0"/>
-          <w:numId w:val="46"/>
+          <w:numId w:val="48"/>
         </w:numPr>
         <w:tabs>
           <w:tab w:val="left" w:pos="939"/>
@@ -3118,7 +3233,8 @@
           <w:sz w:val="20"/>
           <w:szCs w:val="20"/>
         </w:rPr>
-        <w:t>Produire et diffuser les tableaux de bord de qualité des données aux instances de gouvernance.</w:t>
+        <w:lastRenderedPageBreak/>
+        <w:t>Produire et diffuser les indicateurs techniques et tableaux de bord de qualité aux instances de gouvernance.</w:t>
       </w:r>
     </w:p>
     <w:p>
@@ -3126,7 +3242,7 @@
         <w:pStyle w:val="Paragraphedeliste"/>
         <w:numPr>
           <w:ilvl w:val="0"/>
-          <w:numId w:val="46"/>
+          <w:numId w:val="48"/>
         </w:numPr>
         <w:tabs>
           <w:tab w:val="left" w:pos="939"/>
@@ -3151,8 +3267,7 @@
           <w:sz w:val="20"/>
           <w:szCs w:val="20"/>
         </w:rPr>
-        <w:lastRenderedPageBreak/>
-        <w:t>Veiller à la bonne coordination entre les équipes métiers et techniques.</w:t>
+        <w:t>Assurer la passerelle et la coordination opérationnelle entre les équipes métiers et les équipes d'infrastructure technique.</w:t>
       </w:r>
     </w:p>
     <w:p>
@@ -6616,6 +6731,119 @@
     </w:lvl>
   </w:abstractNum>
   <w:abstractNum w:abstractNumId="9" w15:restartNumberingAfterBreak="0">
+    <w:nsid w:val="1DBE3380"/>
+    <w:multiLevelType w:val="hybridMultilevel"/>
+    <w:tmpl w:val="FB860128"/>
+    <w:lvl w:ilvl="0" w:tplc="040C0001">
+      <w:start w:val="1"/>
+      <w:numFmt w:val="bullet"/>
+      <w:lvlText w:val=""/>
+      <w:lvlJc w:val="left"/>
+      <w:pPr>
+        <w:ind w:left="720" w:hanging="360"/>
+      </w:pPr>
+      <w:rPr>
+        <w:rFonts w:ascii="Symbol" w:hAnsi="Symbol" w:hint="default"/>
+      </w:rPr>
+    </w:lvl>
+    <w:lvl w:ilvl="1" w:tplc="040C0003" w:tentative="1">
+      <w:start w:val="1"/>
+      <w:numFmt w:val="bullet"/>
+      <w:lvlText w:val="o"/>
+      <w:lvlJc w:val="left"/>
+      <w:pPr>
+        <w:ind w:left="1440" w:hanging="360"/>
+      </w:pPr>
+      <w:rPr>
+        <w:rFonts w:ascii="Courier New" w:hAnsi="Courier New" w:cs="Courier New" w:hint="default"/>
+      </w:rPr>
+    </w:lvl>
+    <w:lvl w:ilvl="2" w:tplc="040C0005" w:tentative="1">
+      <w:start w:val="1"/>
+      <w:numFmt w:val="bullet"/>
+      <w:lvlText w:val=""/>
+      <w:lvlJc w:val="left"/>
+      <w:pPr>
+        <w:ind w:left="2160" w:hanging="360"/>
+      </w:pPr>
+      <w:rPr>
+        <w:rFonts w:ascii="Wingdings" w:hAnsi="Wingdings" w:hint="default"/>
+      </w:rPr>
+    </w:lvl>
+    <w:lvl w:ilvl="3" w:tplc="040C0001" w:tentative="1">
+      <w:start w:val="1"/>
+      <w:numFmt w:val="bullet"/>
+      <w:lvlText w:val=""/>
+      <w:lvlJc w:val="left"/>
+      <w:pPr>
+        <w:ind w:left="2880" w:hanging="360"/>
+      </w:pPr>
+      <w:rPr>
+        <w:rFonts w:ascii="Symbol" w:hAnsi="Symbol" w:hint="default"/>
+      </w:rPr>
+    </w:lvl>
+    <w:lvl w:ilvl="4" w:tplc="040C0003" w:tentative="1">
+      <w:start w:val="1"/>
+      <w:numFmt w:val="bullet"/>
+      <w:lvlText w:val="o"/>
+      <w:lvlJc w:val="left"/>
+      <w:pPr>
+        <w:ind w:left="3600" w:hanging="360"/>
+      </w:pPr>
+      <w:rPr>
+        <w:rFonts w:ascii="Courier New" w:hAnsi="Courier New" w:cs="Courier New" w:hint="default"/>
+      </w:rPr>
+    </w:lvl>
+    <w:lvl w:ilvl="5" w:tplc="040C0005" w:tentative="1">
+      <w:start w:val="1"/>
+      <w:numFmt w:val="bullet"/>
+      <w:lvlText w:val=""/>
+      <w:lvlJc w:val="left"/>
+      <w:pPr>
+        <w:ind w:left="4320" w:hanging="360"/>
+      </w:pPr>
+      <w:rPr>
+        <w:rFonts w:ascii="Wingdings" w:hAnsi="Wingdings" w:hint="default"/>
+      </w:rPr>
+    </w:lvl>
+    <w:lvl w:ilvl="6" w:tplc="040C0001" w:tentative="1">
+      <w:start w:val="1"/>
+      <w:numFmt w:val="bullet"/>
+      <w:lvlText w:val=""/>
+      <w:lvlJc w:val="left"/>
+      <w:pPr>
+        <w:ind w:left="5040" w:hanging="360"/>
+      </w:pPr>
+      <w:rPr>
+        <w:rFonts w:ascii="Symbol" w:hAnsi="Symbol" w:hint="default"/>
+      </w:rPr>
+    </w:lvl>
+    <w:lvl w:ilvl="7" w:tplc="040C0003" w:tentative="1">
+      <w:start w:val="1"/>
+      <w:numFmt w:val="bullet"/>
+      <w:lvlText w:val="o"/>
+      <w:lvlJc w:val="left"/>
+      <w:pPr>
+        <w:ind w:left="5760" w:hanging="360"/>
+      </w:pPr>
+      <w:rPr>
+        <w:rFonts w:ascii="Courier New" w:hAnsi="Courier New" w:cs="Courier New" w:hint="default"/>
+      </w:rPr>
+    </w:lvl>
+    <w:lvl w:ilvl="8" w:tplc="040C0005" w:tentative="1">
+      <w:start w:val="1"/>
+      <w:numFmt w:val="bullet"/>
+      <w:lvlText w:val=""/>
+      <w:lvlJc w:val="left"/>
+      <w:pPr>
+        <w:ind w:left="6480" w:hanging="360"/>
+      </w:pPr>
+      <w:rPr>
+        <w:rFonts w:ascii="Wingdings" w:hAnsi="Wingdings" w:hint="default"/>
+      </w:rPr>
+    </w:lvl>
+  </w:abstractNum>
+  <w:abstractNum w:abstractNumId="10" w15:restartNumberingAfterBreak="0">
     <w:nsid w:val="2255494D"/>
     <w:multiLevelType w:val="multilevel"/>
     <w:tmpl w:val="DCDEC082"/>
@@ -6736,7 +6964,7 @@
       </w:rPr>
     </w:lvl>
   </w:abstractNum>
-  <w:abstractNum w:abstractNumId="10" w15:restartNumberingAfterBreak="0">
+  <w:abstractNum w:abstractNumId="11" w15:restartNumberingAfterBreak="0">
     <w:nsid w:val="247711C7"/>
     <w:multiLevelType w:val="hybridMultilevel"/>
     <w:tmpl w:val="27C2B37E"/>
@@ -6848,7 +7076,7 @@
       </w:rPr>
     </w:lvl>
   </w:abstractNum>
-  <w:abstractNum w:abstractNumId="11" w15:restartNumberingAfterBreak="0">
+  <w:abstractNum w:abstractNumId="12" w15:restartNumberingAfterBreak="0">
     <w:nsid w:val="27385631"/>
     <w:multiLevelType w:val="hybridMultilevel"/>
     <w:tmpl w:val="BA527C20"/>
@@ -6961,7 +7189,7 @@
       </w:rPr>
     </w:lvl>
   </w:abstractNum>
-  <w:abstractNum w:abstractNumId="12" w15:restartNumberingAfterBreak="0">
+  <w:abstractNum w:abstractNumId="13" w15:restartNumberingAfterBreak="0">
     <w:nsid w:val="29776D34"/>
     <w:multiLevelType w:val="hybridMultilevel"/>
     <w:tmpl w:val="53C29100"/>
@@ -7074,7 +7302,7 @@
       </w:rPr>
     </w:lvl>
   </w:abstractNum>
-  <w:abstractNum w:abstractNumId="13" w15:restartNumberingAfterBreak="0">
+  <w:abstractNum w:abstractNumId="14" w15:restartNumberingAfterBreak="0">
     <w:nsid w:val="2BB20B2B"/>
     <w:multiLevelType w:val="hybridMultilevel"/>
     <w:tmpl w:val="2356FEBC"/>
@@ -7187,7 +7415,7 @@
       </w:rPr>
     </w:lvl>
   </w:abstractNum>
-  <w:abstractNum w:abstractNumId="14" w15:restartNumberingAfterBreak="0">
+  <w:abstractNum w:abstractNumId="15" w15:restartNumberingAfterBreak="0">
     <w:nsid w:val="2D277DA5"/>
     <w:multiLevelType w:val="hybridMultilevel"/>
     <w:tmpl w:val="44F4BD5A"/>
@@ -7301,7 +7529,7 @@
       </w:rPr>
     </w:lvl>
   </w:abstractNum>
-  <w:abstractNum w:abstractNumId="15" w15:restartNumberingAfterBreak="0">
+  <w:abstractNum w:abstractNumId="16" w15:restartNumberingAfterBreak="0">
     <w:nsid w:val="2D5A7F4C"/>
     <w:multiLevelType w:val="multilevel"/>
     <w:tmpl w:val="C7E2B934"/>
@@ -7414,7 +7642,7 @@
       </w:rPr>
     </w:lvl>
   </w:abstractNum>
-  <w:abstractNum w:abstractNumId="16" w15:restartNumberingAfterBreak="0">
+  <w:abstractNum w:abstractNumId="17" w15:restartNumberingAfterBreak="0">
     <w:nsid w:val="2FCB41A2"/>
     <w:multiLevelType w:val="hybridMultilevel"/>
     <w:tmpl w:val="27D22D32"/>
@@ -7527,7 +7755,7 @@
       </w:rPr>
     </w:lvl>
   </w:abstractNum>
-  <w:abstractNum w:abstractNumId="17" w15:restartNumberingAfterBreak="0">
+  <w:abstractNum w:abstractNumId="18" w15:restartNumberingAfterBreak="0">
     <w:nsid w:val="31D56EC7"/>
     <w:multiLevelType w:val="hybridMultilevel"/>
     <w:tmpl w:val="6AB07DAA"/>
@@ -7640,7 +7868,7 @@
       </w:rPr>
     </w:lvl>
   </w:abstractNum>
-  <w:abstractNum w:abstractNumId="18" w15:restartNumberingAfterBreak="0">
+  <w:abstractNum w:abstractNumId="19" w15:restartNumberingAfterBreak="0">
     <w:nsid w:val="37F31999"/>
     <w:multiLevelType w:val="hybridMultilevel"/>
     <w:tmpl w:val="F1DE7452"/>
@@ -7729,7 +7957,7 @@
       </w:pPr>
     </w:lvl>
   </w:abstractNum>
-  <w:abstractNum w:abstractNumId="19" w15:restartNumberingAfterBreak="0">
+  <w:abstractNum w:abstractNumId="20" w15:restartNumberingAfterBreak="0">
     <w:nsid w:val="37FE54A9"/>
     <w:multiLevelType w:val="hybridMultilevel"/>
     <w:tmpl w:val="4FFE1BAC"/>
@@ -7842,7 +8070,7 @@
       </w:rPr>
     </w:lvl>
   </w:abstractNum>
-  <w:abstractNum w:abstractNumId="20" w15:restartNumberingAfterBreak="0">
+  <w:abstractNum w:abstractNumId="21" w15:restartNumberingAfterBreak="0">
     <w:nsid w:val="3AE80DE2"/>
     <w:multiLevelType w:val="multilevel"/>
     <w:tmpl w:val="B2F0547A"/>
@@ -7964,7 +8192,7 @@
       </w:rPr>
     </w:lvl>
   </w:abstractNum>
-  <w:abstractNum w:abstractNumId="21" w15:restartNumberingAfterBreak="0">
+  <w:abstractNum w:abstractNumId="22" w15:restartNumberingAfterBreak="0">
     <w:nsid w:val="3C44434A"/>
     <w:multiLevelType w:val="multilevel"/>
     <w:tmpl w:val="65D892BC"/>
@@ -8095,7 +8323,7 @@
       </w:rPr>
     </w:lvl>
   </w:abstractNum>
-  <w:abstractNum w:abstractNumId="22" w15:restartNumberingAfterBreak="0">
+  <w:abstractNum w:abstractNumId="23" w15:restartNumberingAfterBreak="0">
     <w:nsid w:val="3CD0475F"/>
     <w:multiLevelType w:val="hybridMultilevel"/>
     <w:tmpl w:val="510A7A7E"/>
@@ -8184,7 +8412,7 @@
       </w:pPr>
     </w:lvl>
   </w:abstractNum>
-  <w:abstractNum w:abstractNumId="23" w15:restartNumberingAfterBreak="0">
+  <w:abstractNum w:abstractNumId="24" w15:restartNumberingAfterBreak="0">
     <w:nsid w:val="3E783FCD"/>
     <w:multiLevelType w:val="hybridMultilevel"/>
     <w:tmpl w:val="B95C8616"/>
@@ -8297,7 +8525,7 @@
       </w:rPr>
     </w:lvl>
   </w:abstractNum>
-  <w:abstractNum w:abstractNumId="24" w15:restartNumberingAfterBreak="0">
+  <w:abstractNum w:abstractNumId="25" w15:restartNumberingAfterBreak="0">
     <w:nsid w:val="406B1754"/>
     <w:multiLevelType w:val="hybridMultilevel"/>
     <w:tmpl w:val="389619DA"/>
@@ -8386,7 +8614,7 @@
       </w:pPr>
     </w:lvl>
   </w:abstractNum>
-  <w:abstractNum w:abstractNumId="25" w15:restartNumberingAfterBreak="0">
+  <w:abstractNum w:abstractNumId="26" w15:restartNumberingAfterBreak="0">
     <w:nsid w:val="40F713B9"/>
     <w:multiLevelType w:val="hybridMultilevel"/>
     <w:tmpl w:val="C8806AE2"/>
@@ -8499,7 +8727,7 @@
       </w:rPr>
     </w:lvl>
   </w:abstractNum>
-  <w:abstractNum w:abstractNumId="26" w15:restartNumberingAfterBreak="0">
+  <w:abstractNum w:abstractNumId="27" w15:restartNumberingAfterBreak="0">
     <w:nsid w:val="45A80887"/>
     <w:multiLevelType w:val="hybridMultilevel"/>
     <w:tmpl w:val="8340B232"/>
@@ -8612,7 +8840,7 @@
       </w:rPr>
     </w:lvl>
   </w:abstractNum>
-  <w:abstractNum w:abstractNumId="27" w15:restartNumberingAfterBreak="0">
+  <w:abstractNum w:abstractNumId="28" w15:restartNumberingAfterBreak="0">
     <w:nsid w:val="46613DE7"/>
     <w:multiLevelType w:val="hybridMultilevel"/>
     <w:tmpl w:val="12FA64BA"/>
@@ -8725,7 +8953,7 @@
       </w:rPr>
     </w:lvl>
   </w:abstractNum>
-  <w:abstractNum w:abstractNumId="28" w15:restartNumberingAfterBreak="0">
+  <w:abstractNum w:abstractNumId="29" w15:restartNumberingAfterBreak="0">
     <w:nsid w:val="4A945F68"/>
     <w:multiLevelType w:val="multilevel"/>
     <w:tmpl w:val="040C001F"/>
@@ -8811,7 +9039,7 @@
       </w:pPr>
     </w:lvl>
   </w:abstractNum>
-  <w:abstractNum w:abstractNumId="29" w15:restartNumberingAfterBreak="0">
+  <w:abstractNum w:abstractNumId="30" w15:restartNumberingAfterBreak="0">
     <w:nsid w:val="4DA7387B"/>
     <w:multiLevelType w:val="multilevel"/>
     <w:tmpl w:val="021C5988"/>
@@ -8924,7 +9152,7 @@
       </w:rPr>
     </w:lvl>
   </w:abstractNum>
-  <w:abstractNum w:abstractNumId="30" w15:restartNumberingAfterBreak="0">
+  <w:abstractNum w:abstractNumId="31" w15:restartNumberingAfterBreak="0">
     <w:nsid w:val="50AF0ACC"/>
     <w:multiLevelType w:val="multilevel"/>
     <w:tmpl w:val="C278EE7A"/>
@@ -9069,7 +9297,7 @@
       </w:rPr>
     </w:lvl>
   </w:abstractNum>
-  <w:abstractNum w:abstractNumId="31" w15:restartNumberingAfterBreak="0">
+  <w:abstractNum w:abstractNumId="32" w15:restartNumberingAfterBreak="0">
     <w:nsid w:val="528451EB"/>
     <w:multiLevelType w:val="multilevel"/>
     <w:tmpl w:val="E0FA898C"/>
@@ -9182,7 +9410,7 @@
       </w:rPr>
     </w:lvl>
   </w:abstractNum>
-  <w:abstractNum w:abstractNumId="32" w15:restartNumberingAfterBreak="0">
+  <w:abstractNum w:abstractNumId="33" w15:restartNumberingAfterBreak="0">
     <w:nsid w:val="5A39162B"/>
     <w:multiLevelType w:val="multilevel"/>
     <w:tmpl w:val="614E7DB8"/>
@@ -9295,7 +9523,7 @@
       </w:rPr>
     </w:lvl>
   </w:abstractNum>
-  <w:abstractNum w:abstractNumId="33" w15:restartNumberingAfterBreak="0">
+  <w:abstractNum w:abstractNumId="34" w15:restartNumberingAfterBreak="0">
     <w:nsid w:val="5A536911"/>
     <w:multiLevelType w:val="hybridMultilevel"/>
     <w:tmpl w:val="DFD8E888"/>
@@ -9381,7 +9609,7 @@
       </w:pPr>
     </w:lvl>
   </w:abstractNum>
-  <w:abstractNum w:abstractNumId="34" w15:restartNumberingAfterBreak="0">
+  <w:abstractNum w:abstractNumId="35" w15:restartNumberingAfterBreak="0">
     <w:nsid w:val="5C6A128F"/>
     <w:multiLevelType w:val="hybridMultilevel"/>
     <w:tmpl w:val="3962DE34"/>
@@ -9494,7 +9722,7 @@
       </w:rPr>
     </w:lvl>
   </w:abstractNum>
-  <w:abstractNum w:abstractNumId="35" w15:restartNumberingAfterBreak="0">
+  <w:abstractNum w:abstractNumId="36" w15:restartNumberingAfterBreak="0">
     <w:nsid w:val="60154AC6"/>
     <w:multiLevelType w:val="hybridMultilevel"/>
     <w:tmpl w:val="958819BA"/>
@@ -9607,7 +9835,7 @@
       </w:rPr>
     </w:lvl>
   </w:abstractNum>
-  <w:abstractNum w:abstractNumId="36" w15:restartNumberingAfterBreak="0">
+  <w:abstractNum w:abstractNumId="37" w15:restartNumberingAfterBreak="0">
     <w:nsid w:val="63D52B90"/>
     <w:multiLevelType w:val="hybridMultilevel"/>
     <w:tmpl w:val="EAA8B9E8"/>
@@ -9720,7 +9948,7 @@
       </w:rPr>
     </w:lvl>
   </w:abstractNum>
-  <w:abstractNum w:abstractNumId="37" w15:restartNumberingAfterBreak="0">
+  <w:abstractNum w:abstractNumId="38" w15:restartNumberingAfterBreak="0">
     <w:nsid w:val="68236280"/>
     <w:multiLevelType w:val="hybridMultilevel"/>
     <w:tmpl w:val="2A2078BA"/>
@@ -9833,7 +10061,7 @@
       </w:rPr>
     </w:lvl>
   </w:abstractNum>
-  <w:abstractNum w:abstractNumId="38" w15:restartNumberingAfterBreak="0">
+  <w:abstractNum w:abstractNumId="39" w15:restartNumberingAfterBreak="0">
     <w:nsid w:val="6DF10A44"/>
     <w:multiLevelType w:val="multilevel"/>
     <w:tmpl w:val="F4ACEF32"/>
@@ -9982,7 +10210,7 @@
       </w:rPr>
     </w:lvl>
   </w:abstractNum>
-  <w:abstractNum w:abstractNumId="39" w15:restartNumberingAfterBreak="0">
+  <w:abstractNum w:abstractNumId="40" w15:restartNumberingAfterBreak="0">
     <w:nsid w:val="6ED81B20"/>
     <w:multiLevelType w:val="hybridMultilevel"/>
     <w:tmpl w:val="B31EFC4E"/>
@@ -10095,7 +10323,7 @@
       </w:rPr>
     </w:lvl>
   </w:abstractNum>
-  <w:abstractNum w:abstractNumId="40" w15:restartNumberingAfterBreak="0">
+  <w:abstractNum w:abstractNumId="41" w15:restartNumberingAfterBreak="0">
     <w:nsid w:val="700F4824"/>
     <w:multiLevelType w:val="multilevel"/>
     <w:tmpl w:val="040C001F"/>
@@ -10181,7 +10409,7 @@
       </w:pPr>
     </w:lvl>
   </w:abstractNum>
-  <w:abstractNum w:abstractNumId="41" w15:restartNumberingAfterBreak="0">
+  <w:abstractNum w:abstractNumId="42" w15:restartNumberingAfterBreak="0">
     <w:nsid w:val="712C7662"/>
     <w:multiLevelType w:val="hybridMultilevel"/>
     <w:tmpl w:val="5440A48A"/>
@@ -10294,7 +10522,7 @@
       </w:rPr>
     </w:lvl>
   </w:abstractNum>
-  <w:abstractNum w:abstractNumId="42" w15:restartNumberingAfterBreak="0">
+  <w:abstractNum w:abstractNumId="43" w15:restartNumberingAfterBreak="0">
     <w:nsid w:val="715C36B4"/>
     <w:multiLevelType w:val="hybridMultilevel"/>
     <w:tmpl w:val="B31CB550"/>
@@ -10407,7 +10635,7 @@
       </w:rPr>
     </w:lvl>
   </w:abstractNum>
-  <w:abstractNum w:abstractNumId="43" w15:restartNumberingAfterBreak="0">
+  <w:abstractNum w:abstractNumId="44" w15:restartNumberingAfterBreak="0">
     <w:nsid w:val="7584160D"/>
     <w:multiLevelType w:val="hybridMultilevel"/>
     <w:tmpl w:val="3B463DF4"/>
@@ -10520,7 +10748,7 @@
       </w:rPr>
     </w:lvl>
   </w:abstractNum>
-  <w:abstractNum w:abstractNumId="44" w15:restartNumberingAfterBreak="0">
+  <w:abstractNum w:abstractNumId="45" w15:restartNumberingAfterBreak="0">
     <w:nsid w:val="79F20EAC"/>
     <w:multiLevelType w:val="hybridMultilevel"/>
     <w:tmpl w:val="E4BCBF8E"/>
@@ -10633,7 +10861,7 @@
       </w:rPr>
     </w:lvl>
   </w:abstractNum>
-  <w:abstractNum w:abstractNumId="45" w15:restartNumberingAfterBreak="0">
+  <w:abstractNum w:abstractNumId="46" w15:restartNumberingAfterBreak="0">
     <w:nsid w:val="7BD9772C"/>
     <w:multiLevelType w:val="hybridMultilevel"/>
     <w:tmpl w:val="4D4CE11E"/>
@@ -10746,7 +10974,7 @@
       </w:rPr>
     </w:lvl>
   </w:abstractNum>
-  <w:abstractNum w:abstractNumId="46" w15:restartNumberingAfterBreak="0">
+  <w:abstractNum w:abstractNumId="47" w15:restartNumberingAfterBreak="0">
     <w:nsid w:val="7C627D18"/>
     <w:multiLevelType w:val="multilevel"/>
     <w:tmpl w:val="3416B176"/>
@@ -10837,31 +11065,31 @@
     </w:lvl>
   </w:abstractNum>
   <w:num w:numId="1" w16cid:durableId="980572115">
-    <w:abstractNumId w:val="12"/>
+    <w:abstractNumId w:val="13"/>
   </w:num>
   <w:num w:numId="2" w16cid:durableId="38211206">
-    <w:abstractNumId w:val="18"/>
+    <w:abstractNumId w:val="19"/>
   </w:num>
   <w:num w:numId="3" w16cid:durableId="790176148">
-    <w:abstractNumId w:val="14"/>
+    <w:abstractNumId w:val="15"/>
   </w:num>
   <w:num w:numId="4" w16cid:durableId="1257861575">
-    <w:abstractNumId w:val="43"/>
+    <w:abstractNumId w:val="44"/>
   </w:num>
   <w:num w:numId="5" w16cid:durableId="1258296468">
-    <w:abstractNumId w:val="29"/>
+    <w:abstractNumId w:val="30"/>
   </w:num>
   <w:num w:numId="6" w16cid:durableId="332294388">
-    <w:abstractNumId w:val="38"/>
+    <w:abstractNumId w:val="39"/>
   </w:num>
   <w:num w:numId="7" w16cid:durableId="710761443">
-    <w:abstractNumId w:val="46"/>
+    <w:abstractNumId w:val="47"/>
   </w:num>
   <w:num w:numId="8" w16cid:durableId="1236163112">
     <w:abstractNumId w:val="4"/>
   </w:num>
   <w:num w:numId="9" w16cid:durableId="1999533451">
-    <w:abstractNumId w:val="13"/>
+    <w:abstractNumId w:val="14"/>
   </w:num>
   <w:num w:numId="10" w16cid:durableId="1758162575">
     <w:abstractNumId w:val="6"/>
@@ -10873,34 +11101,34 @@
     <w:abstractNumId w:val="5"/>
   </w:num>
   <w:num w:numId="13" w16cid:durableId="334385254">
-    <w:abstractNumId w:val="45"/>
+    <w:abstractNumId w:val="46"/>
   </w:num>
   <w:num w:numId="14" w16cid:durableId="2088653471">
-    <w:abstractNumId w:val="20"/>
+    <w:abstractNumId w:val="21"/>
   </w:num>
   <w:num w:numId="15" w16cid:durableId="1660185664">
-    <w:abstractNumId w:val="35"/>
+    <w:abstractNumId w:val="36"/>
   </w:num>
   <w:num w:numId="16" w16cid:durableId="60717438">
-    <w:abstractNumId w:val="42"/>
+    <w:abstractNumId w:val="43"/>
   </w:num>
   <w:num w:numId="17" w16cid:durableId="1181704918">
-    <w:abstractNumId w:val="30"/>
+    <w:abstractNumId w:val="31"/>
   </w:num>
   <w:num w:numId="18" w16cid:durableId="1761609077">
-    <w:abstractNumId w:val="16"/>
+    <w:abstractNumId w:val="17"/>
   </w:num>
   <w:num w:numId="19" w16cid:durableId="2048605804">
-    <w:abstractNumId w:val="36"/>
+    <w:abstractNumId w:val="37"/>
   </w:num>
   <w:num w:numId="20" w16cid:durableId="1928534927">
-    <w:abstractNumId w:val="31"/>
+    <w:abstractNumId w:val="32"/>
   </w:num>
   <w:num w:numId="21" w16cid:durableId="1158958506">
-    <w:abstractNumId w:val="11"/>
+    <w:abstractNumId w:val="12"/>
   </w:num>
   <w:num w:numId="22" w16cid:durableId="282620053">
-    <w:abstractNumId w:val="41"/>
+    <w:abstractNumId w:val="42"/>
   </w:num>
   <w:num w:numId="23" w16cid:durableId="164443174">
     <w:abstractNumId w:val="0"/>
@@ -10909,25 +11137,25 @@
     <w:abstractNumId w:val="1"/>
   </w:num>
   <w:num w:numId="25" w16cid:durableId="1543595467">
-    <w:abstractNumId w:val="39"/>
+    <w:abstractNumId w:val="40"/>
   </w:num>
   <w:num w:numId="26" w16cid:durableId="14581714">
-    <w:abstractNumId w:val="32"/>
+    <w:abstractNumId w:val="33"/>
   </w:num>
   <w:num w:numId="27" w16cid:durableId="44842525">
-    <w:abstractNumId w:val="40"/>
+    <w:abstractNumId w:val="41"/>
   </w:num>
   <w:num w:numId="28" w16cid:durableId="2009936758">
-    <w:abstractNumId w:val="21"/>
+    <w:abstractNumId w:val="22"/>
   </w:num>
   <w:num w:numId="29" w16cid:durableId="951866218">
-    <w:abstractNumId w:val="23"/>
+    <w:abstractNumId w:val="24"/>
   </w:num>
   <w:num w:numId="30" w16cid:durableId="1466505743">
     <w:abstractNumId w:val="8"/>
   </w:num>
   <w:num w:numId="31" w16cid:durableId="2058815805">
-    <w:abstractNumId w:val="44"/>
+    <w:abstractNumId w:val="45"/>
   </w:num>
   <w:num w:numId="32" w16cid:durableId="1491752331">
     <w:abstractNumId w:val="2"/>
@@ -10936,46 +11164,49 @@
     <w:abstractNumId w:val="3"/>
   </w:num>
   <w:num w:numId="34" w16cid:durableId="1795902918">
+    <w:abstractNumId w:val="11"/>
+  </w:num>
+  <w:num w:numId="35" w16cid:durableId="1915164760">
+    <w:abstractNumId w:val="29"/>
+  </w:num>
+  <w:num w:numId="36" w16cid:durableId="425927396">
+    <w:abstractNumId w:val="16"/>
+  </w:num>
+  <w:num w:numId="37" w16cid:durableId="1148088650">
+    <w:abstractNumId w:val="18"/>
+  </w:num>
+  <w:num w:numId="38" w16cid:durableId="1459104719">
+    <w:abstractNumId w:val="38"/>
+  </w:num>
+  <w:num w:numId="39" w16cid:durableId="826168426">
+    <w:abstractNumId w:val="34"/>
+  </w:num>
+  <w:num w:numId="40" w16cid:durableId="645940523">
     <w:abstractNumId w:val="10"/>
   </w:num>
-  <w:num w:numId="35" w16cid:durableId="1915164760">
+  <w:num w:numId="41" w16cid:durableId="912273646">
+    <w:abstractNumId w:val="35"/>
+  </w:num>
+  <w:num w:numId="42" w16cid:durableId="1044211526">
+    <w:abstractNumId w:val="25"/>
+  </w:num>
+  <w:num w:numId="43" w16cid:durableId="42559096">
+    <w:abstractNumId w:val="23"/>
+  </w:num>
+  <w:num w:numId="44" w16cid:durableId="919173876">
+    <w:abstractNumId w:val="27"/>
+  </w:num>
+  <w:num w:numId="45" w16cid:durableId="526262652">
+    <w:abstractNumId w:val="26"/>
+  </w:num>
+  <w:num w:numId="46" w16cid:durableId="1839496465">
+    <w:abstractNumId w:val="20"/>
+  </w:num>
+  <w:num w:numId="47" w16cid:durableId="376009423">
     <w:abstractNumId w:val="28"/>
   </w:num>
-  <w:num w:numId="36" w16cid:durableId="425927396">
-    <w:abstractNumId w:val="15"/>
-  </w:num>
-  <w:num w:numId="37" w16cid:durableId="1148088650">
-    <w:abstractNumId w:val="17"/>
-  </w:num>
-  <w:num w:numId="38" w16cid:durableId="1459104719">
-    <w:abstractNumId w:val="37"/>
-  </w:num>
-  <w:num w:numId="39" w16cid:durableId="826168426">
-    <w:abstractNumId w:val="33"/>
-  </w:num>
-  <w:num w:numId="40" w16cid:durableId="645940523">
+  <w:num w:numId="48" w16cid:durableId="1433166688">
     <w:abstractNumId w:val="9"/>
-  </w:num>
-  <w:num w:numId="41" w16cid:durableId="912273646">
-    <w:abstractNumId w:val="34"/>
-  </w:num>
-  <w:num w:numId="42" w16cid:durableId="1044211526">
-    <w:abstractNumId w:val="24"/>
-  </w:num>
-  <w:num w:numId="43" w16cid:durableId="42559096">
-    <w:abstractNumId w:val="22"/>
-  </w:num>
-  <w:num w:numId="44" w16cid:durableId="919173876">
-    <w:abstractNumId w:val="26"/>
-  </w:num>
-  <w:num w:numId="45" w16cid:durableId="526262652">
-    <w:abstractNumId w:val="25"/>
-  </w:num>
-  <w:num w:numId="46" w16cid:durableId="1839496465">
-    <w:abstractNumId w:val="19"/>
-  </w:num>
-  <w:num w:numId="47" w16cid:durableId="376009423">
-    <w:abstractNumId w:val="27"/>
   </w:num>
   <w:numIdMacAtCleanup w:val="10"/>
 </w:numbering>
@@ -11462,7 +11693,6 @@
   <w:style w:type="character" w:default="1" w:styleId="Policepardfaut">
     <w:name w:val="Default Paragraph Font"/>
     <w:uiPriority w:val="1"/>
-    <w:semiHidden/>
     <w:unhideWhenUsed/>
   </w:style>
   <w:style w:type="table" w:default="1" w:styleId="TableauNormal">

</xml_diff>